<commit_message>
Propaga a reconferência ao guia, à cola e ao CLAUDE.md
Três falhas de Nível A, não duas: 1.3.1 entra ao lado de 1.4.1 e 2.2.2,
coerente com o item 2 do checklist. A narrativa fica mais precisa, não
mais fraca: as duas do banner continuam sendo as que nenhuma das três
ferramentas automáticas viu, e é disso que o trabalho trata.

Quatro falhas de AA, não cinco: o 1.4.10 sai.

CLAUDE.md registra o terceiro ponto cego do pipeline — o bloco provisório
da barra federal — e a regra que sai dele: medir nas duas condições, com
e sem o script de terceiro, e nunca atribuir ao sítio um número colhido
em estado degradado.

Co-Authored-By: Claude Opus 5 <noreply@anthropic.com>
Claude-Session: https://claude.ai/code/session_011caxTYjUXUpMAXmSLT46C5
</commit_message>
<xml_diff>
--- a/COLA_APRESENTACAO.docx
+++ b/COLA_APRESENTACAO.docx
@@ -45,7 +45,7 @@
           <w:color w:val="555555"/>
           <w:sz w:val="23"/>
         </w:rPr>
-        <w:t xml:space="preserve">  — por 1.4.1 (slide ativo só pela cor) e 2.2.2 (banner sem pausa). Uma falha de Nível A derruba a conformidade em qualquer nível.</w:t>
+        <w:t xml:space="preserve">  — 3 falhas de Nível A: 1.3.1 (contato sem cabeçalho algum), 1.4.1 (slide ativo só pela cor) e 2.2.2 (banner sem pausa). As duas do banner nenhuma ferramenta automática pegou. Uma falha de Nível A derruba a conformidade em qualquer nível.</w:t>
       </w:r>
     </w:p>
     <w:p>
@@ -547,7 +547,7 @@
           <w:color w:val="1A1A1A"/>
           <w:sz w:val="23"/>
         </w:rPr>
-        <w:t>“Não atinge o Nível A por dois critérios. E os dois têm correção de baixo custo.”</w:t>
+        <w:t>“Não atinge o Nível A. E os dois critérios que nenhuma ferramenta pegou têm correção de baixo custo.”</w:t>
       </w:r>
     </w:p>
     <w:p>
@@ -596,7 +596,7 @@
           <w:color w:val="1A1A1A"/>
           <w:sz w:val="23"/>
         </w:rPr>
-        <w:t>Mede aderência ao eMAG, não conformidade WCAG. Não testa 2.2.2 nem 1.4.1 — os dois que derrubam o Nível A.</w:t>
+        <w:t>Mede aderência ao eMAG, não conformidade WCAG. Não testa 2.2.2 nem 1.4.1 — dois dos três de Nível A que o portal não atende.</w:t>
       </w:r>
     </w:p>
     <w:p>

</xml_diff>